<commit_message>
feat: implement food ordering module with backend services, database migrations, and frontend management pages
</commit_message>
<xml_diff>
--- a/DOCUMENT/TỔNG HỢP API MOBILE APP (CUSTOMER & DRIVER).docx
+++ b/DOCUMENT/TỔNG HỢP API MOBILE APP (CUSTOMER & DRIVER).docx
@@ -1,6 +1,6 @@
 
 <file path=word/document.xml><?xml version="1.0" encoding="utf-8"?>
-<w:document xmlns:w="http://schemas.openxmlformats.org/wordprocessingml/2006/main" xmlns:r="http://schemas.openxmlformats.org/officeDocument/2006/relationships">
+<w:document xmlns:w="http://schemas.openxmlformats.org/wordprocessingml/2006/main">
   <w:body>
     <w:p>
       <w:pPr>
@@ -3067,19 +3067,15 @@
       <w:r>
         <w:rPr>
           <w:b/>
-          <w:sz w:val="19"/>
-          <w:color w:val="333333"/>
-          <w:rFonts w:ascii="Arial" w:hAnsi="Arial"/>
+          <w:color w:val="333333"/>
         </w:rPr>
         <w:t xml:space="preserve">• Mô tả: </w:t>
       </w:r>
       <w:r>
         <w:rPr>
-          <w:sz w:val="19"/>
-          <w:color w:val="333333"/>
-          <w:rFonts w:ascii="Arial" w:hAnsi="Arial"/>
-        </w:rPr>
-        <w:t xml:space="preserve">Khách hàng gửi đơn đặt món ăn. Hệ thống tạo đơn PENDING và bắn chuông báo tới ứng dụng nhà hàng.</w:t>
+          <w:color w:val="333333"/>
+        </w:rPr>
+        <w:t>Khách hàng gửi đơn đặt món ăn. Nếu chọn CASH (tiền mặt), hệ thống tạo đơn PENDING và bắn chuông báo tới nhà hàng. Nếu chọn WALLET (Ví OmniPay) hoặc MOMO/VNPAY, hệ thống tạo đơn AWAITING_PAYMENT (chờ thanh toán thành công trước khi gửi đơn cho nhà hàng tiếp nhận).</w:t>
       </w:r>
     </w:p>
     <w:p>
@@ -3448,19 +3444,15 @@
       <w:r>
         <w:rPr>
           <w:b/>
-          <w:sz w:val="19"/>
-          <w:color w:val="333333"/>
-          <w:rFonts w:ascii="Arial" w:hAnsi="Arial"/>
+          <w:color w:val="333333"/>
         </w:rPr>
         <w:t xml:space="preserve">• Kết quả trả về (Response): </w:t>
       </w:r>
       <w:r>
         <w:rPr>
-          <w:sz w:val="19"/>
-          <w:color w:val="2E75B6"/>
-          <w:rFonts w:ascii="Consolas" w:hAnsi="Consolas"/>
-        </w:rPr>
-        <w:t xml:space="preserve">ApiResponse&lt;FoodOrderResponse&gt; (orderId, status: 'PENDING', totalPrice, deliveryFee, items, estimatedDeliveryMinutes)</w:t>
+          <w:color w:val="2E75B6"/>
+        </w:rPr>
+        <w:t>ApiResponse&lt;FoodOrderResponse&gt; (orderId, status: 'PENDING' hoặc 'AWAITING_PAYMENT', isPaid, totalPrice, deliveryFee, items, estimatedDeliveryMinutes)</w:t>
       </w:r>
     </w:p>
     <w:p>
@@ -3470,6 +3462,85 @@
       <w:r>
         <w:rPr>
           <w:b/>
+          <w:color w:val="1F4E79"/>
+        </w:rPr>
+        <w:t xml:space="preserve">[PATCH] </w:t>
+      </w:r>
+      <w:r>
+        <w:rPr>
+          <w:b/>
+          <w:color w:val="000000"/>
+        </w:rPr>
+        <w:t>/api/v1/food-orders/{orderId}/switch-to-cash</w:t>
+      </w:r>
+    </w:p>
+    <w:p>
+      <w:r>
+        <w:rPr>
+          <w:b/>
+          <w:color w:val="333333"/>
+        </w:rPr>
+        <w:t xml:space="preserve">• Mô tả: </w:t>
+      </w:r>
+      <w:r>
+        <w:rPr>
+          <w:color w:val="333333"/>
+        </w:rPr>
+        <w:t>Khách hàng đổi phương thức thanh toán sang Tiền mặt (CASH) khi giao dịch thanh toán online (Ví/MoMo/VNPay) thất bại, không đủ số dư hoặc khách đổi ý. Đơn hàng chuyển ngay từ AWAITING_PAYMENT sang PENDING để quán nhận và làm món.</w:t>
+      </w:r>
+    </w:p>
+    <w:p>
+      <w:r>
+        <w:rPr>
+          <w:b/>
+          <w:color w:val="333333"/>
+        </w:rPr>
+        <w:t xml:space="preserve">• Phân quyền / Header: </w:t>
+      </w:r>
+      <w:r>
+        <w:rPr>
+          <w:color w:val="595959"/>
+        </w:rPr>
+        <w:t>Bearer Token (Header X-User-Id)</w:t>
+      </w:r>
+    </w:p>
+    <w:p>
+      <w:r>
+        <w:rPr>
+          <w:b/>
+          <w:color w:val="333333"/>
+        </w:rPr>
+        <w:t xml:space="preserve">• Tham số (Path / Query Params): </w:t>
+      </w:r>
+      <w:r>
+        <w:rPr>
+          <w:color w:val="595959"/>
+        </w:rPr>
+        <w:t>orderId (Long - Mã đơn hàng đồ ăn)</w:t>
+      </w:r>
+    </w:p>
+    <w:p>
+      <w:r>
+        <w:rPr>
+          <w:b/>
+          <w:color w:val="333333"/>
+        </w:rPr>
+        <w:t xml:space="preserve">• Kết quả trả về (Response): </w:t>
+      </w:r>
+      <w:r>
+        <w:rPr>
+          <w:color w:val="2E75B6"/>
+        </w:rPr>
+        <w:t>ApiResponse&lt;FoodOrderResponse&gt; (status: 'PENDING', paymentMethod: 'CASH', isPaid: false)</w:t>
+      </w:r>
+    </w:p>
+    <w:p>
+      <w:pPr>
+        <w:spacing w:before="240" w:after="60"/>
+      </w:pPr>
+      <w:r>
+        <w:rPr>
+          <w:b/>
           <w:sz w:val="22"/>
           <w:color w:val="375623"/>
           <w:rFonts w:ascii="Arial" w:hAnsi="Arial"/>
@@ -3701,19 +3772,15 @@
       <w:r>
         <w:rPr>
           <w:b/>
-          <w:sz w:val="19"/>
-          <w:color w:val="333333"/>
-          <w:rFonts w:ascii="Arial" w:hAnsi="Arial"/>
+          <w:color w:val="333333"/>
         </w:rPr>
         <w:t xml:space="preserve">• Mô tả: </w:t>
       </w:r>
       <w:r>
         <w:rPr>
-          <w:sz w:val="19"/>
-          <w:color w:val="333333"/>
-          <w:rFonts w:ascii="Arial" w:hAnsi="Arial"/>
-        </w:rPr>
-        <w:t xml:space="preserve">Khách hàng hủy đơn đặt món. Chỉ được phép hủy khi đơn ở trạng thái PENDING hoặc ACCEPTED (quán chưa bắt đầu nấu PREPARING).</w:t>
+          <w:color w:val="333333"/>
+        </w:rPr>
+        <w:t>Khách hàng hủy đơn đặt món. Được phép hủy khi đơn ở trạng thái AWAITING_PAYMENT, PENDING hoặc NO_DRIVER_FOUND (trước khi quán bắt đầu nấu PREPARING). Nếu đơn đã trừ tiền ví OmniPay, hệ thống tự động hoàn tiền 100% về ví ngay lập tức.</w:t>
       </w:r>
     </w:p>
     <w:p>
@@ -3763,6 +3830,57 @@
       </w:r>
     </w:p>
     <w:p>
+      <w:r>
+        <w:rPr>
+          <w:b/>
+          <w:color w:val="1F4E79"/>
+        </w:rPr>
+        <w:t>• Danh sách trường Request Body (JSON):</w:t>
+      </w:r>
+    </w:p>
+    <w:p>
+      <w:r>
+        <w:rPr>
+          <w:b/>
+          <w:color w:val="2E75B6"/>
+        </w:rPr>
+        <w:t xml:space="preserve">- reason: </w:t>
+      </w:r>
+      <w:r>
+        <w:rPr>
+          <w:color w:val="7F7F7F"/>
+        </w:rPr>
+        <w:t xml:space="preserve">(String) </w:t>
+      </w:r>
+      <w:r>
+        <w:rPr>
+          <w:color w:val="333333"/>
+        </w:rPr>
+        <w:t>[Tùy chọn] Lý do khách hủy đơn</w:t>
+      </w:r>
+    </w:p>
+    <w:p>
+      <w:r>
+        <w:rPr>
+          <w:b/>
+          <w:color w:val="2E75B6"/>
+        </w:rPr>
+        <w:t xml:space="preserve">- reasonCode: </w:t>
+      </w:r>
+      <w:r>
+        <w:rPr>
+          <w:color w:val="7F7F7F"/>
+        </w:rPr>
+        <w:t xml:space="preserve">(String) </w:t>
+      </w:r>
+      <w:r>
+        <w:rPr>
+          <w:color w:val="333333"/>
+        </w:rPr>
+        <w:t>[Tùy chọn] Mã lý do: 'CHANGED_MIND', 'FOUND_BETTER_PRICE', 'LONG_WAIT_TIME', 'PAYMENT_FAILED', 'NO_DRIVER_FOUND', 'OTHER'</w:t>
+      </w:r>
+    </w:p>
+    <w:p>
       <w:pPr>
         <w:ind w:left="360"/>
         <w:spacing w:before="20" w:after="60"/>
@@ -3770,19 +3888,94 @@
       <w:r>
         <w:rPr>
           <w:b/>
-          <w:sz w:val="19"/>
-          <w:color w:val="333333"/>
-          <w:rFonts w:ascii="Arial" w:hAnsi="Arial"/>
+          <w:color w:val="333333"/>
         </w:rPr>
         <w:t xml:space="preserve">• Kết quả trả về (Response): </w:t>
       </w:r>
       <w:r>
         <w:rPr>
-          <w:sz w:val="19"/>
-          <w:color w:val="2E75B6"/>
-          <w:rFonts w:ascii="Consolas" w:hAnsi="Consolas"/>
-        </w:rPr>
-        <w:t xml:space="preserve">ApiResponse&lt;FoodOrderResponse&gt; (Đơn hàng chuyển trạng thái CANCELLED, hoàn tiền ví nếu đã thanh toán)</w:t>
+          <w:color w:val="2E75B6"/>
+        </w:rPr>
+        <w:t>ApiResponse&lt;FoodOrderResponse&gt; (status: 'CANCELLED', cancelledBy: 'CUSTOMER', cancelReason, cancelReasonCode, tự động hoàn tiền ví)</w:t>
+      </w:r>
+    </w:p>
+    <w:p>
+      <w:pPr>
+        <w:spacing w:before="240" w:after="60"/>
+      </w:pPr>
+      <w:r>
+        <w:rPr>
+          <w:b/>
+          <w:color w:val="1F4E79"/>
+        </w:rPr>
+        <w:t xml:space="preserve">[POST] </w:t>
+      </w:r>
+      <w:r>
+        <w:rPr>
+          <w:b/>
+          <w:color w:val="000000"/>
+        </w:rPr>
+        <w:t>/api/v1/food-orders/{orderId}/retry-driver</w:t>
+      </w:r>
+    </w:p>
+    <w:p>
+      <w:r>
+        <w:rPr>
+          <w:b/>
+          <w:color w:val="333333"/>
+        </w:rPr>
+        <w:t xml:space="preserve">• Mô tả: </w:t>
+      </w:r>
+      <w:r>
+        <w:rPr>
+          <w:color w:val="333333"/>
+        </w:rPr>
+        <w:t>Khách hàng bấm tìm lại tài xế khi đơn rơi vào trạng thái NO_DRIVER_FOUND (hệ thống chưa tìm được tài xế sau các đợt quét). Cho phép retry tối đa 3 lần.</w:t>
+      </w:r>
+    </w:p>
+    <w:p>
+      <w:r>
+        <w:rPr>
+          <w:b/>
+          <w:color w:val="333333"/>
+        </w:rPr>
+        <w:t xml:space="preserve">• Phân quyền / Header: </w:t>
+      </w:r>
+      <w:r>
+        <w:rPr>
+          <w:color w:val="595959"/>
+        </w:rPr>
+        <w:t>Bearer Token (Header X-User-Id)</w:t>
+      </w:r>
+    </w:p>
+    <w:p>
+      <w:r>
+        <w:rPr>
+          <w:b/>
+          <w:color w:val="333333"/>
+        </w:rPr>
+        <w:t xml:space="preserve">• Tham số (Path / Query Params): </w:t>
+      </w:r>
+      <w:r>
+        <w:rPr>
+          <w:color w:val="595959"/>
+        </w:rPr>
+        <w:t>orderId (Long - Mã đơn hàng đồ ăn)</w:t>
+      </w:r>
+    </w:p>
+    <w:p>
+      <w:r>
+        <w:rPr>
+          <w:b/>
+          <w:color w:val="333333"/>
+        </w:rPr>
+        <w:t xml:space="preserve">• Kết quả trả về (Response): </w:t>
+      </w:r>
+      <w:r>
+        <w:rPr>
+          <w:color w:val="2E75B6"/>
+        </w:rPr>
+        <w:t>ApiResponse&lt;FoodOrderResponse&gt; (driverRetryCount tăng thêm 1, tiếp tục quét tài xế)</w:t>
       </w:r>
     </w:p>
     <w:p>
@@ -6384,19 +6577,15 @@
       <w:r>
         <w:rPr>
           <w:b/>
-          <w:sz w:val="19"/>
-          <w:color w:val="333333"/>
-          <w:rFonts w:ascii="Arial" w:hAnsi="Arial"/>
+          <w:color w:val="333333"/>
         </w:rPr>
         <w:t xml:space="preserve">• Mô tả: </w:t>
       </w:r>
       <w:r>
         <w:rPr>
-          <w:sz w:val="19"/>
-          <w:color w:val="333333"/>
-          <w:rFonts w:ascii="Arial" w:hAnsi="Arial"/>
-        </w:rPr>
-        <w:t xml:space="preserve">Tài xế cập nhật tiến trình giao món ăn: Chuyển sang 'DELIVERING' khi đã lấy thức ăn tại nhà hàng (GPS &lt;= 50m); Chuyển sang 'COMPLETED' khi đã giao tận tay khách (GPS &lt;= 50m). Khi hoàn thành, kích hoạt quyết toán doanh thu giao hàng vào ví tài xế.</w:t>
+          <w:color w:val="333333"/>
+        </w:rPr>
+        <w:t>Tài xế cập nhật tiến trình giao món ăn: Chuyển sang 'DELIVERING' khi đã lấy thức ăn tại quán (GPS &lt;= 50m); Chuyển sang 'COMPLETED' khi đã giao tận tay khách (GPS &lt;= 50m); Hoặc chuyển sang 'CANCELLED' khi gặp sự cố khẩn cấp. LƯU Ý THU TIỀN: Nếu đơn là tiền mặt CASH (isPaid = false), tài xế thu đủ tiền mặt từ khách; Nếu đơn đã thanh toán ví/online (isPaid = true), màn hình tài xế hiển thị rõ tiền mặt cần thu = 0đ (KHÔNG thu tiền mặt của khách).</w:t>
       </w:r>
     </w:p>
     <w:p>
@@ -6468,28 +6657,63 @@
       <w:r>
         <w:rPr>
           <w:b/>
-          <w:sz w:val="18"/>
-          <w:color w:val="2E75B6"/>
-          <w:rFonts w:ascii="Consolas" w:hAnsi="Consolas"/>
+          <w:color w:val="2E75B6"/>
         </w:rPr>
         <w:t xml:space="preserve">- status: </w:t>
       </w:r>
       <w:r>
         <w:rPr>
-          <w:i/>
-          <w:sz w:val="18"/>
           <w:color w:val="7F7F7F"/>
-          <w:rFonts w:ascii="Arial" w:hAnsi="Arial"/>
         </w:rPr>
         <w:t xml:space="preserve">(String) </w:t>
       </w:r>
       <w:r>
         <w:rPr>
-          <w:sz w:val="18"/>
-          <w:color w:val="333333"/>
-          <w:rFonts w:ascii="Arial" w:hAnsi="Arial"/>
-        </w:rPr>
-        <w:t xml:space="preserve">[Bắt buộc] Trạng thái tài xế cập nhật: 'DELIVERING' (Đang giao) hoặc 'COMPLETED' (Đã giao thành công)</w:t>
+          <w:color w:val="333333"/>
+        </w:rPr>
+        <w:t>[Bắt buộc] Trạng thái tài xế cập nhật: 'DELIVERING' (Đang giao), 'COMPLETED' (Đã giao thành công), hoặc 'CANCELLED' (Sự cố hủy đơn)</w:t>
+      </w:r>
+    </w:p>
+    <w:p>
+      <w:r>
+        <w:rPr>
+          <w:b/>
+          <w:color w:val="2E75B6"/>
+        </w:rPr>
+        <w:t xml:space="preserve">- reason: </w:t>
+      </w:r>
+      <w:r>
+        <w:rPr>
+          <w:color w:val="7F7F7F"/>
+        </w:rPr>
+        <w:t xml:space="preserve">(String) </w:t>
+      </w:r>
+      <w:r>
+        <w:rPr>
+          <w:color w:val="333333"/>
+        </w:rPr>
+        <w:t>[Tùy chọn] Lý do tài xế hủy đơn nếu status là CANCELLED</w:t>
+      </w:r>
+    </w:p>
+    <w:p>
+      <w:r>
+        <w:rPr>
+          <w:b/>
+          <w:color w:val="2E75B6"/>
+        </w:rPr>
+        <w:t xml:space="preserve">- reasonCode: </w:t>
+      </w:r>
+      <w:r>
+        <w:rPr>
+          <w:color w:val="7F7F7F"/>
+        </w:rPr>
+        <w:t xml:space="preserve">(String) </w:t>
+      </w:r>
+      <w:r>
+        <w:rPr>
+          <w:color w:val="333333"/>
+        </w:rPr>
+        <w:t>[Tùy chọn] Mã lý do tài xế hủy: 'DRIVER_VEHICLE_BREAKDOWN', 'CUSTOMER_UNREACHABLE', 'OTHER'</w:t>
       </w:r>
     </w:p>
     <w:p>
@@ -6500,19 +6724,15 @@
       <w:r>
         <w:rPr>
           <w:b/>
-          <w:sz w:val="19"/>
-          <w:color w:val="333333"/>
-          <w:rFonts w:ascii="Arial" w:hAnsi="Arial"/>
+          <w:color w:val="333333"/>
         </w:rPr>
         <w:t xml:space="preserve">• Kết quả trả về (Response): </w:t>
       </w:r>
       <w:r>
         <w:rPr>
-          <w:sz w:val="19"/>
-          <w:color w:val="2E75B6"/>
-          <w:rFonts w:ascii="Consolas" w:hAnsi="Consolas"/>
-        </w:rPr>
-        <w:t xml:space="preserve">ApiResponse&lt;FoodOrderResponse&gt; (Trạng thái đơn hàng mới sau cập nhật)</w:t>
+          <w:color w:val="2E75B6"/>
+        </w:rPr>
+        <w:t>ApiResponse&lt;FoodOrderResponse&gt; (status, isPaid, cancelledBy, cancelReason, cancelReasonCode)</w:t>
       </w:r>
     </w:p>
     <w:p>
@@ -7279,6 +7499,11 @@
         <w:t xml:space="preserve">FoodOrderAssignedMessage (orderId, driverId, driverName, driverPhone, vehiclePlate)</w:t>
       </w:r>
     </w:p>
+    <w:sectPr>
+      <w:pgSz w:w="11906" w:h="16838"/>
+      <w:pgMar w:top="1440" w:right="1440" w:bottom="1440" w:left="1440" w:header="720" w:footer="720" w:gutter="0"/>
+      <w:cols w:space="720"/>
+    </w:sectPr>
     <w:sectPr>
       <w:pgSz w:w="11906" w:h="16838"/>
       <w:pgMar w:top="1440" w:right="1440" w:bottom="1440" w:left="1440" w:header="720" w:footer="720" w:gutter="0"/>

</xml_diff>